<commit_message>
717: Add thrust limits guide
</commit_message>
<xml_diff>
--- a/MD-11/Thrust_Limits_and_FADEC.docx
+++ b/MD-11/Thrust_Limits_and_FADEC.docx
@@ -114,7 +114,7 @@
           <w:sz w:val="24"/>
           <w:szCs w:val="24"/>
         </w:rPr>
-        <w:t>10/20/2025</w:t>
+        <w:t>3/6/2026</w:t>
       </w:r>
       <w:r>
         <w:rPr>
@@ -2533,7 +2533,13 @@
         <w:t xml:space="preserve">Switches the respective engine into </w:t>
       </w:r>
       <w:r>
-        <w:t>alternate m</w:t>
+        <w:t>A</w:t>
+      </w:r>
+      <w:r>
+        <w:t xml:space="preserve">lternate </w:t>
+      </w:r>
+      <w:r>
+        <w:t>M</w:t>
       </w:r>
       <w:r>
         <w:t>ode.</w:t>
@@ -2980,6 +2986,9 @@
       </w:r>
       <w:r>
         <w:t>Alternate</w:t>
+      </w:r>
+      <w:r>
+        <w:t xml:space="preserve"> Mode</w:t>
       </w:r>
       <w:r>
         <w:t xml:space="preserve"> is selected on the overhead panel, </w:t>
@@ -3296,7 +3305,7 @@
         <v:path o:extrusionok="f" gradientshapeok="t" o:connecttype="rect"/>
         <o:lock v:ext="edit" aspectratio="t"/>
       </v:shapetype>
-      <v:shape id="_x0000_i1030" type="#_x0000_t75" style="width:87.4pt;height:24pt;visibility:visible;mso-wrap-style:square" o:bullet="t">
+      <v:shape id="_x0000_i1025" type="#_x0000_t75" style="width:87.55pt;height:24.2pt;visibility:visible;mso-wrap-style:square" o:bullet="t">
         <v:imagedata r:id="rId1" o:title=""/>
       </v:shape>
     </w:pict>

</xml_diff>